<commit_message>
feat: add cite to reports
</commit_message>
<xml_diff>
--- a/Отчеты/lab01/report.docx
+++ b/Отчеты/lab01/report.docx
@@ -217,27 +217,7 @@
         <w:t xml:space="preserve"> </w:t>
       </w:r>
       <w:r>
-        <w:t xml:space="preserve">[</w:t>
-      </w:r>
-      <w:r>
-        <w:rPr>
-          <w:b/>
-          <w:bCs/>
-        </w:rPr>
-        <w:t xml:space="preserve">kotelnikov_chebotaev_book_latex2_ru?</w:t>
-      </w:r>
-      <w:r>
-        <w:t xml:space="preserve">,</w:t>
-      </w:r>
-      <w:r>
-        <w:rPr>
-          <w:b/>
-          <w:bCs/>
-        </w:rPr>
-        <w:t xml:space="preserve">lvovsky_book_latex_ru?</w:t>
-      </w:r>
-      <w:r>
-        <w:t xml:space="preserve">]</w:t>
+        <w:t xml:space="preserve">[1,2]</w:t>
       </w:r>
       <w:r>
         <w:t xml:space="preserve">.</w:t>
@@ -748,7 +728,7 @@
       </w:r>
     </w:p>
     <w:bookmarkEnd w:id="35"/>
-    <w:bookmarkStart w:id="37" w:name="список-литературы"/>
+    <w:bookmarkStart w:id="39" w:name="список-литературы"/>
     <w:p>
       <w:pPr>
         <w:pStyle w:val="Heading1"/>
@@ -757,9 +737,65 @@
         <w:t xml:space="preserve">Список литературы</w:t>
       </w:r>
     </w:p>
-    <w:bookmarkStart w:id="36" w:name="refs"/>
+    <w:bookmarkStart w:id="38" w:name="refs"/>
+    <w:bookmarkStart w:id="36" w:name="ref-kotelnikov_chebotaev_book_latex2_ru"/>
+    <w:p>
+      <w:pPr>
+        <w:pStyle w:val="Bibliography"/>
+      </w:pPr>
+      <w:r>
+        <w:t xml:space="preserve">1.</w:t>
+      </w:r>
+      <w:r>
+        <w:t xml:space="preserve"> </w:t>
+      </w:r>
+      <w:r>
+        <w:t xml:space="preserve">	</w:t>
+      </w:r>
+      <w:r>
+        <w:t xml:space="preserve">Котельников А.А., Чеботаев А.С.</w:t>
+      </w:r>
+      <w:r>
+        <w:t xml:space="preserve"> </w:t>
+      </w:r>
+      <w:r>
+        <w:t xml:space="preserve">LaTeX2 по-русски</w:t>
+      </w:r>
+      <w:r>
+        <w:t xml:space="preserve">. 3-е изд. Новосибирск: Новосибирск, 2004. 496 с.</w:t>
+      </w:r>
+    </w:p>
     <w:bookmarkEnd w:id="36"/>
+    <w:bookmarkStart w:id="37" w:name="ref-lvovsky_book_latex_ru"/>
+    <w:p>
+      <w:pPr>
+        <w:pStyle w:val="Bibliography"/>
+      </w:pPr>
+      <w:r>
+        <w:t xml:space="preserve">2.</w:t>
+      </w:r>
+      <w:r>
+        <w:t xml:space="preserve"> </w:t>
+      </w:r>
+      <w:r>
+        <w:t xml:space="preserve">	</w:t>
+      </w:r>
+      <w:r>
+        <w:t xml:space="preserve">Львовский С.М.</w:t>
+      </w:r>
+      <w:r>
+        <w:t xml:space="preserve"> </w:t>
+      </w:r>
+      <w:r>
+        <w:t xml:space="preserve">Набор и вёрстка в системе LaTeX</w:t>
+      </w:r>
+      <w:r>
+        <w:t xml:space="preserve">. 3-е изд., испр. и доп. МЦНМО, 2003. 447 с.</w:t>
+      </w:r>
+    </w:p>
     <w:bookmarkEnd w:id="37"/>
+    <w:bookmarkEnd w:id="38"/>
+    <w:bookmarkEnd w:id="39"/>
     <w:sectPr>
       <w:footnotePr>
         <w:numRestart w:val="eachSect"/>

</xml_diff>